<commit_message>
Add preview_timeline_mediapipe.py - main script for timeline visualization with MediaPipe
</commit_message>
<xml_diff>
--- a/readme.docx
+++ b/readme.docx
@@ -515,72 +515,70 @@
           <w:color w:val="0F1115"/>
           <w:sz w:val="20"/>
           <w:szCs w:val="20"/>
-          <w:lang w:eastAsia="ru-RU"/>
-        </w:rPr>
-      </w:pPr>
+          <w:lang w:val="en-US" w:eastAsia="ru-RU"/>
+        </w:rPr>
+      </w:pPr>
+      <w:proofErr w:type="gramStart"/>
+      <w:r>
+        <w:rPr>
+          <w:rFonts w:ascii="Consolas" w:eastAsia="Times New Roman" w:hAnsi="Consolas" w:cs="Courier New"/>
+          <w:color w:val="0F1115"/>
+          <w:sz w:val="20"/>
+          <w:szCs w:val="20"/>
+          <w:lang w:val="en-US" w:eastAsia="ru-RU"/>
+        </w:rPr>
+        <w:t>pip</w:t>
+      </w:r>
+      <w:proofErr w:type="gramEnd"/>
+      <w:r>
+        <w:rPr>
+          <w:rFonts w:ascii="Consolas" w:eastAsia="Times New Roman" w:hAnsi="Consolas" w:cs="Courier New"/>
+          <w:color w:val="0F1115"/>
+          <w:sz w:val="20"/>
+          <w:szCs w:val="20"/>
+          <w:lang w:val="en-US" w:eastAsia="ru-RU"/>
+        </w:rPr>
+        <w:t xml:space="preserve"> </w:t>
+      </w:r>
+      <w:r>
+        <w:rPr>
+          <w:rFonts w:ascii="Consolas" w:eastAsia="Times New Roman" w:hAnsi="Consolas" w:cs="Courier New"/>
+          <w:color w:val="4078F2"/>
+          <w:sz w:val="20"/>
+          <w:szCs w:val="20"/>
+          <w:lang w:val="en-US" w:eastAsia="ru-RU"/>
+        </w:rPr>
+        <w:t>install</w:t>
+      </w:r>
+      <w:r>
+        <w:rPr>
+          <w:rFonts w:ascii="Consolas" w:eastAsia="Times New Roman" w:hAnsi="Consolas" w:cs="Courier New"/>
+          <w:color w:val="0F1115"/>
+          <w:sz w:val="20"/>
+          <w:szCs w:val="20"/>
+          <w:lang w:val="en-US" w:eastAsia="ru-RU"/>
+        </w:rPr>
+        <w:t xml:space="preserve"> </w:t>
+      </w:r>
       <w:proofErr w:type="spellStart"/>
       <w:r>
         <w:rPr>
           <w:rFonts w:ascii="Consolas" w:eastAsia="Times New Roman" w:hAnsi="Consolas" w:cs="Courier New"/>
-          <w:color w:val="0F1115"/>
-          <w:sz w:val="20"/>
-          <w:szCs w:val="20"/>
-          <w:lang w:eastAsia="ru-RU"/>
-        </w:rPr>
-        <w:t>pip</w:t>
+          <w:color w:val="4078F2"/>
+          <w:sz w:val="20"/>
+          <w:szCs w:val="20"/>
+          <w:lang w:val="en-US" w:eastAsia="ru-RU"/>
+        </w:rPr>
+        <w:t>tensorflow</w:t>
       </w:r>
       <w:proofErr w:type="spellEnd"/>
       <w:r>
         <w:rPr>
           <w:rFonts w:ascii="Consolas" w:eastAsia="Times New Roman" w:hAnsi="Consolas" w:cs="Courier New"/>
-          <w:color w:val="0F1115"/>
-          <w:sz w:val="20"/>
-          <w:szCs w:val="20"/>
-          <w:lang w:eastAsia="ru-RU"/>
-        </w:rPr>
-        <w:t xml:space="preserve"> </w:t>
-      </w:r>
-      <w:proofErr w:type="spellStart"/>
-      <w:r>
-        <w:rPr>
-          <w:rFonts w:ascii="Consolas" w:eastAsia="Times New Roman" w:hAnsi="Consolas" w:cs="Courier New"/>
           <w:color w:val="4078F2"/>
           <w:sz w:val="20"/>
           <w:szCs w:val="20"/>
-          <w:lang w:eastAsia="ru-RU"/>
-        </w:rPr>
-        <w:t>install</w:t>
-      </w:r>
-      <w:proofErr w:type="spellEnd"/>
-      <w:r>
-        <w:rPr>
-          <w:rFonts w:ascii="Consolas" w:eastAsia="Times New Roman" w:hAnsi="Consolas" w:cs="Courier New"/>
-          <w:color w:val="0F1115"/>
-          <w:sz w:val="20"/>
-          <w:szCs w:val="20"/>
-          <w:lang w:eastAsia="ru-RU"/>
-        </w:rPr>
-        <w:t xml:space="preserve"> </w:t>
-      </w:r>
-      <w:proofErr w:type="spellStart"/>
-      <w:r>
-        <w:rPr>
-          <w:rFonts w:ascii="Consolas" w:eastAsia="Times New Roman" w:hAnsi="Consolas" w:cs="Courier New"/>
-          <w:color w:val="4078F2"/>
-          <w:sz w:val="20"/>
-          <w:szCs w:val="20"/>
-          <w:lang w:eastAsia="ru-RU"/>
-        </w:rPr>
-        <w:t>tensorflow</w:t>
-      </w:r>
-      <w:proofErr w:type="spellEnd"/>
-      <w:r>
-        <w:rPr>
-          <w:rFonts w:ascii="Consolas" w:eastAsia="Times New Roman" w:hAnsi="Consolas" w:cs="Courier New"/>
-          <w:color w:val="4078F2"/>
-          <w:sz w:val="20"/>
-          <w:szCs w:val="20"/>
-          <w:lang w:eastAsia="ru-RU"/>
+          <w:lang w:val="en-US" w:eastAsia="ru-RU"/>
         </w:rPr>
         <w:t>==</w:t>
       </w:r>
@@ -590,7 +588,7 @@
           <w:color w:val="B76B01"/>
           <w:sz w:val="20"/>
           <w:szCs w:val="20"/>
-          <w:lang w:eastAsia="ru-RU"/>
+          <w:lang w:val="en-US" w:eastAsia="ru-RU"/>
         </w:rPr>
         <w:t>2.4</w:t>
       </w:r>
@@ -600,7 +598,7 @@
           <w:color w:val="0F1115"/>
           <w:sz w:val="20"/>
           <w:szCs w:val="20"/>
-          <w:lang w:eastAsia="ru-RU"/>
+          <w:lang w:val="en-US" w:eastAsia="ru-RU"/>
         </w:rPr>
         <w:t>.1</w:t>
       </w:r>
@@ -1039,8 +1037,22 @@
       </w:pPr>
     </w:p>
     <w:p>
-      <w:r>
-        <w:t>НА ГИТ</w:t>
+      <w:pPr>
+        <w:rPr>
+          <w:lang w:val="en-US"/>
+        </w:rPr>
+      </w:pPr>
+      <w:r>
+        <w:t>НА</w:t>
+      </w:r>
+      <w:r>
+        <w:rPr>
+          <w:lang w:val="en-US"/>
+        </w:rPr>
+        <w:t xml:space="preserve"> </w:t>
+      </w:r>
+      <w:r>
+        <w:t>ГИТ</w:t>
       </w:r>
     </w:p>
     <w:p>
@@ -1069,59 +1081,178 @@
           <w:rFonts w:ascii="Segoe UI" w:hAnsi="Segoe UI" w:cs="Segoe UI"/>
           <w:color w:val="0F1115"/>
           <w:shd w:val="clear" w:color="auto" w:fill="FFFFFF"/>
+          <w:lang w:val="en-US"/>
         </w:rPr>
       </w:pPr>
       <w:proofErr w:type="spellStart"/>
+      <w:proofErr w:type="gramStart"/>
       <w:r>
         <w:rPr>
           <w:rFonts w:ascii="Consolas" w:eastAsia="Times New Roman" w:hAnsi="Consolas" w:cs="Courier New"/>
           <w:color w:val="4078F2"/>
           <w:sz w:val="20"/>
           <w:szCs w:val="20"/>
-          <w:lang w:eastAsia="ru-RU"/>
+          <w:lang w:val="en-US" w:eastAsia="ru-RU"/>
         </w:rPr>
         <w:t>git</w:t>
       </w:r>
       <w:proofErr w:type="spellEnd"/>
-      <w:r>
-        <w:rPr>
-          <w:rFonts w:ascii="Consolas" w:eastAsia="Times New Roman" w:hAnsi="Consolas" w:cs="Courier New"/>
-          <w:color w:val="0F1115"/>
-          <w:sz w:val="20"/>
-          <w:szCs w:val="20"/>
-          <w:lang w:eastAsia="ru-RU"/>
+      <w:proofErr w:type="gramEnd"/>
+      <w:r>
+        <w:rPr>
+          <w:rFonts w:ascii="Consolas" w:eastAsia="Times New Roman" w:hAnsi="Consolas" w:cs="Courier New"/>
+          <w:color w:val="0F1115"/>
+          <w:sz w:val="20"/>
+          <w:szCs w:val="20"/>
+          <w:lang w:val="en-US" w:eastAsia="ru-RU"/>
+        </w:rPr>
+        <w:t xml:space="preserve"> status</w:t>
+      </w:r>
+      <w:r>
+        <w:rPr>
+          <w:rFonts w:ascii="Consolas" w:eastAsia="Times New Roman" w:hAnsi="Consolas" w:cs="Courier New"/>
+          <w:color w:val="0F1115"/>
+          <w:sz w:val="20"/>
+          <w:szCs w:val="20"/>
+          <w:lang w:val="en-US" w:eastAsia="ru-RU"/>
+        </w:rPr>
+        <w:t xml:space="preserve"> – </w:t>
+      </w:r>
+      <w:r>
+        <w:rPr>
+          <w:rFonts w:ascii="Segoe UI" w:hAnsi="Segoe UI" w:cs="Segoe UI"/>
+          <w:color w:val="0F1115"/>
+          <w:shd w:val="clear" w:color="auto" w:fill="FFFFFF"/>
+        </w:rPr>
+        <w:t>Вы</w:t>
+      </w:r>
+      <w:r>
+        <w:rPr>
+          <w:rFonts w:ascii="Segoe UI" w:hAnsi="Segoe UI" w:cs="Segoe UI"/>
+          <w:color w:val="0F1115"/>
+          <w:shd w:val="clear" w:color="auto" w:fill="FFFFFF"/>
+          <w:lang w:val="en-US"/>
         </w:rPr>
         <w:t xml:space="preserve"> </w:t>
       </w:r>
-      <w:proofErr w:type="spellStart"/>
-      <w:r>
-        <w:rPr>
-          <w:rFonts w:ascii="Consolas" w:eastAsia="Times New Roman" w:hAnsi="Consolas" w:cs="Courier New"/>
-          <w:color w:val="0F1115"/>
-          <w:sz w:val="20"/>
-          <w:szCs w:val="20"/>
-          <w:lang w:eastAsia="ru-RU"/>
-        </w:rPr>
-        <w:t>status</w:t>
-      </w:r>
-      <w:proofErr w:type="spellEnd"/>
-      <w:r>
-        <w:rPr>
-          <w:rFonts w:ascii="Consolas" w:eastAsia="Times New Roman" w:hAnsi="Consolas" w:cs="Courier New"/>
-          <w:color w:val="0F1115"/>
-          <w:sz w:val="20"/>
-          <w:szCs w:val="20"/>
-          <w:lang w:eastAsia="ru-RU"/>
-        </w:rPr>
-        <w:t xml:space="preserve"> – </w:t>
-      </w:r>
-      <w:r>
-        <w:rPr>
-          <w:rFonts w:ascii="Segoe UI" w:hAnsi="Segoe UI" w:cs="Segoe UI"/>
-          <w:color w:val="0F1115"/>
-          <w:shd w:val="clear" w:color="auto" w:fill="FFFFFF"/>
-        </w:rPr>
-        <w:t>Вы увидите список изменённых и новых файлов (например, </w:t>
+      <w:r>
+        <w:rPr>
+          <w:rFonts w:ascii="Segoe UI" w:hAnsi="Segoe UI" w:cs="Segoe UI"/>
+          <w:color w:val="0F1115"/>
+          <w:shd w:val="clear" w:color="auto" w:fill="FFFFFF"/>
+        </w:rPr>
+        <w:t>увидите</w:t>
+      </w:r>
+      <w:r>
+        <w:rPr>
+          <w:rFonts w:ascii="Segoe UI" w:hAnsi="Segoe UI" w:cs="Segoe UI"/>
+          <w:color w:val="0F1115"/>
+          <w:shd w:val="clear" w:color="auto" w:fill="FFFFFF"/>
+          <w:lang w:val="en-US"/>
+        </w:rPr>
+        <w:t xml:space="preserve"> </w:t>
+      </w:r>
+      <w:r>
+        <w:rPr>
+          <w:rFonts w:ascii="Segoe UI" w:hAnsi="Segoe UI" w:cs="Segoe UI"/>
+          <w:color w:val="0F1115"/>
+          <w:shd w:val="clear" w:color="auto" w:fill="FFFFFF"/>
+        </w:rPr>
+        <w:t>список</w:t>
+      </w:r>
+      <w:r>
+        <w:rPr>
+          <w:rFonts w:ascii="Segoe UI" w:hAnsi="Segoe UI" w:cs="Segoe UI"/>
+          <w:color w:val="0F1115"/>
+          <w:shd w:val="clear" w:color="auto" w:fill="FFFFFF"/>
+          <w:lang w:val="en-US"/>
+        </w:rPr>
+        <w:t xml:space="preserve"> </w:t>
+      </w:r>
+      <w:r>
+        <w:rPr>
+          <w:rFonts w:ascii="Segoe UI" w:hAnsi="Segoe UI" w:cs="Segoe UI"/>
+          <w:color w:val="0F1115"/>
+          <w:shd w:val="clear" w:color="auto" w:fill="FFFFFF"/>
+        </w:rPr>
+        <w:t>изменённых</w:t>
+      </w:r>
+      <w:r>
+        <w:rPr>
+          <w:rFonts w:ascii="Segoe UI" w:hAnsi="Segoe UI" w:cs="Segoe UI"/>
+          <w:color w:val="0F1115"/>
+          <w:shd w:val="clear" w:color="auto" w:fill="FFFFFF"/>
+          <w:lang w:val="en-US"/>
+        </w:rPr>
+        <w:t xml:space="preserve"> </w:t>
+      </w:r>
+      <w:r>
+        <w:rPr>
+          <w:rFonts w:ascii="Segoe UI" w:hAnsi="Segoe UI" w:cs="Segoe UI"/>
+          <w:color w:val="0F1115"/>
+          <w:shd w:val="clear" w:color="auto" w:fill="FFFFFF"/>
+        </w:rPr>
+        <w:t>и</w:t>
+      </w:r>
+      <w:r>
+        <w:rPr>
+          <w:rFonts w:ascii="Segoe UI" w:hAnsi="Segoe UI" w:cs="Segoe UI"/>
+          <w:color w:val="0F1115"/>
+          <w:shd w:val="clear" w:color="auto" w:fill="FFFFFF"/>
+          <w:lang w:val="en-US"/>
+        </w:rPr>
+        <w:t xml:space="preserve"> </w:t>
+      </w:r>
+      <w:r>
+        <w:rPr>
+          <w:rFonts w:ascii="Segoe UI" w:hAnsi="Segoe UI" w:cs="Segoe UI"/>
+          <w:color w:val="0F1115"/>
+          <w:shd w:val="clear" w:color="auto" w:fill="FFFFFF"/>
+        </w:rPr>
+        <w:t>новых</w:t>
+      </w:r>
+      <w:r>
+        <w:rPr>
+          <w:rFonts w:ascii="Segoe UI" w:hAnsi="Segoe UI" w:cs="Segoe UI"/>
+          <w:color w:val="0F1115"/>
+          <w:shd w:val="clear" w:color="auto" w:fill="FFFFFF"/>
+          <w:lang w:val="en-US"/>
+        </w:rPr>
+        <w:t xml:space="preserve"> </w:t>
+      </w:r>
+      <w:r>
+        <w:rPr>
+          <w:rFonts w:ascii="Segoe UI" w:hAnsi="Segoe UI" w:cs="Segoe UI"/>
+          <w:color w:val="0F1115"/>
+          <w:shd w:val="clear" w:color="auto" w:fill="FFFFFF"/>
+        </w:rPr>
+        <w:t>файлов</w:t>
+      </w:r>
+      <w:r>
+        <w:rPr>
+          <w:rFonts w:ascii="Segoe UI" w:hAnsi="Segoe UI" w:cs="Segoe UI"/>
+          <w:color w:val="0F1115"/>
+          <w:shd w:val="clear" w:color="auto" w:fill="FFFFFF"/>
+          <w:lang w:val="en-US"/>
+        </w:rPr>
+        <w:t xml:space="preserve"> (</w:t>
+      </w:r>
+      <w:r>
+        <w:rPr>
+          <w:rFonts w:ascii="Segoe UI" w:hAnsi="Segoe UI" w:cs="Segoe UI"/>
+          <w:color w:val="0F1115"/>
+          <w:shd w:val="clear" w:color="auto" w:fill="FFFFFF"/>
+        </w:rPr>
+        <w:t>например</w:t>
+      </w:r>
+      <w:r>
+        <w:rPr>
+          <w:rFonts w:ascii="Segoe UI" w:hAnsi="Segoe UI" w:cs="Segoe UI"/>
+          <w:color w:val="0F1115"/>
+          <w:shd w:val="clear" w:color="auto" w:fill="FFFFFF"/>
+          <w:lang w:val="en-US"/>
+        </w:rPr>
+        <w:t>, </w:t>
       </w:r>
       <w:r>
         <w:rPr>
@@ -1129,6 +1260,7 @@
           <w:rFonts w:ascii="Consolas" w:eastAsiaTheme="minorHAnsi" w:hAnsi="Consolas"/>
           <w:color w:val="0F1115"/>
           <w:shd w:val="clear" w:color="auto" w:fill="EBEEF2"/>
+          <w:lang w:val="en-US"/>
         </w:rPr>
         <w:t>preview_timeline_mediapipe.py</w:t>
       </w:r>
@@ -1137,6 +1269,7 @@
           <w:rFonts w:ascii="Segoe UI" w:hAnsi="Segoe UI" w:cs="Segoe UI"/>
           <w:color w:val="0F1115"/>
           <w:shd w:val="clear" w:color="auto" w:fill="FFFFFF"/>
+          <w:lang w:val="en-US"/>
         </w:rPr>
         <w:t>, </w:t>
       </w:r>
@@ -1147,6 +1280,7 @@
           <w:rFonts w:ascii="Consolas" w:eastAsiaTheme="minorHAnsi" w:hAnsi="Consolas"/>
           <w:color w:val="0F1115"/>
           <w:shd w:val="clear" w:color="auto" w:fill="EBEEF2"/>
+          <w:lang w:val="en-US"/>
         </w:rPr>
         <w:t>zones.json</w:t>
       </w:r>
@@ -1156,8 +1290,26 @@
           <w:rFonts w:ascii="Segoe UI" w:hAnsi="Segoe UI" w:cs="Segoe UI"/>
           <w:color w:val="0F1115"/>
           <w:shd w:val="clear" w:color="auto" w:fill="FFFFFF"/>
-        </w:rPr>
-        <w:t>, возможно </w:t>
+          <w:lang w:val="en-US"/>
+        </w:rPr>
+        <w:t xml:space="preserve">, </w:t>
+      </w:r>
+      <w:r>
+        <w:rPr>
+          <w:rFonts w:ascii="Segoe UI" w:hAnsi="Segoe UI" w:cs="Segoe UI"/>
+          <w:color w:val="0F1115"/>
+          <w:shd w:val="clear" w:color="auto" w:fill="FFFFFF"/>
+        </w:rPr>
+        <w:t>возможно</w:t>
+      </w:r>
+      <w:r>
+        <w:rPr>
+          <w:rFonts w:ascii="Segoe UI" w:hAnsi="Segoe UI" w:cs="Segoe UI"/>
+          <w:color w:val="0F1115"/>
+          <w:shd w:val="clear" w:color="auto" w:fill="FFFFFF"/>
+          <w:lang w:val="en-US"/>
+        </w:rPr>
+        <w:t> </w:t>
       </w:r>
       <w:r>
         <w:rPr>
@@ -1165,6 +1317,7 @@
           <w:rFonts w:ascii="Consolas" w:eastAsiaTheme="minorHAnsi" w:hAnsi="Consolas"/>
           <w:color w:val="0F1115"/>
           <w:shd w:val="clear" w:color="auto" w:fill="EBEEF2"/>
+          <w:lang w:val="en-US"/>
         </w:rPr>
         <w:t>custom_classifier.h5</w:t>
       </w:r>
@@ -1173,8 +1326,43 @@
           <w:rFonts w:ascii="Segoe UI" w:hAnsi="Segoe UI" w:cs="Segoe UI"/>
           <w:color w:val="0F1115"/>
           <w:shd w:val="clear" w:color="auto" w:fill="FFFFFF"/>
-        </w:rPr>
-        <w:t> и другие).</w:t>
+          <w:lang w:val="en-US"/>
+        </w:rPr>
+        <w:t> </w:t>
+      </w:r>
+      <w:r>
+        <w:rPr>
+          <w:rFonts w:ascii="Segoe UI" w:hAnsi="Segoe UI" w:cs="Segoe UI"/>
+          <w:color w:val="0F1115"/>
+          <w:shd w:val="clear" w:color="auto" w:fill="FFFFFF"/>
+        </w:rPr>
+        <w:t>и</w:t>
+      </w:r>
+      <w:r>
+        <w:rPr>
+          <w:rFonts w:ascii="Segoe UI" w:hAnsi="Segoe UI" w:cs="Segoe UI"/>
+          <w:color w:val="0F1115"/>
+          <w:shd w:val="clear" w:color="auto" w:fill="FFFFFF"/>
+          <w:lang w:val="en-US"/>
+        </w:rPr>
+        <w:t xml:space="preserve"> </w:t>
+      </w:r>
+      <w:r>
+        <w:rPr>
+          <w:rFonts w:ascii="Segoe UI" w:hAnsi="Segoe UI" w:cs="Segoe UI"/>
+          <w:color w:val="0F1115"/>
+          <w:shd w:val="clear" w:color="auto" w:fill="FFFFFF"/>
+        </w:rPr>
+        <w:t>другие</w:t>
+      </w:r>
+      <w:r>
+        <w:rPr>
+          <w:rFonts w:ascii="Segoe UI" w:hAnsi="Segoe UI" w:cs="Segoe UI"/>
+          <w:color w:val="0F1115"/>
+          <w:shd w:val="clear" w:color="auto" w:fill="FFFFFF"/>
+          <w:lang w:val="en-US"/>
+        </w:rPr>
+        <w:t>).</w:t>
       </w:r>
     </w:p>
     <w:p>
@@ -1203,6 +1391,7 @@
           <w:rFonts w:ascii="Segoe UI" w:hAnsi="Segoe UI" w:cs="Segoe UI"/>
           <w:color w:val="0F1115"/>
           <w:shd w:val="clear" w:color="auto" w:fill="FFFFFF"/>
+          <w:lang w:val="en-US"/>
         </w:rPr>
       </w:pPr>
     </w:p>
@@ -1330,6 +1519,71 @@
           <w:lang w:eastAsia="ru-RU"/>
         </w:rPr>
       </w:pPr>
+    </w:p>
+    <w:p>
+      <w:pPr>
+        <w:pStyle w:val="HTML"/>
+        <w:wordWrap w:val="0"/>
+        <w:spacing w:line="330" w:lineRule="atLeast"/>
+        <w:rPr>
+          <w:rFonts w:ascii="Consolas" w:hAnsi="Consolas"/>
+          <w:color w:val="0F1115"/>
+        </w:rPr>
+      </w:pPr>
+      <w:proofErr w:type="spellStart"/>
+      <w:proofErr w:type="gramStart"/>
+      <w:r>
+        <w:rPr>
+          <w:lang w:val="en-US"/>
+        </w:rPr>
+        <w:t>git</w:t>
+      </w:r>
+      <w:proofErr w:type="spellEnd"/>
+      <w:proofErr w:type="gramEnd"/>
+      <w:r>
+        <w:t xml:space="preserve"> </w:t>
+      </w:r>
+      <w:r>
+        <w:rPr>
+          <w:lang w:val="en-US"/>
+        </w:rPr>
+        <w:t>commit</w:t>
+      </w:r>
+      <w:r>
+        <w:t xml:space="preserve"> -</w:t>
+      </w:r>
+      <w:r>
+        <w:rPr>
+          <w:lang w:val="en-US"/>
+        </w:rPr>
+        <w:t>m</w:t>
+      </w:r>
+      <w:r>
+        <w:t xml:space="preserve"> "</w:t>
+      </w:r>
+      <w:r>
+        <w:rPr>
+          <w:rStyle w:val="token"/>
+          <w:rFonts w:ascii="Consolas" w:hAnsi="Consolas"/>
+          <w:color w:val="50A14F"/>
+        </w:rPr>
+        <w:t xml:space="preserve"> </w:t>
+      </w:r>
+      <w:r>
+        <w:rPr>
+          <w:rStyle w:val="token"/>
+          <w:rFonts w:ascii="Consolas" w:hAnsi="Consolas"/>
+          <w:color w:val="50A14F"/>
+        </w:rPr>
+        <w:t>Ваш комментарий</w:t>
+      </w:r>
+      <w:r>
+        <w:t>"</w:t>
+      </w:r>
+    </w:p>
+    <w:p/>
+    <w:p/>
+    <w:p>
       <w:bookmarkStart w:id="0" w:name="_GoBack"/>
       <w:bookmarkEnd w:id="0"/>
     </w:p>
@@ -1771,7 +2025,6 @@
     <w:basedOn w:val="a"/>
     <w:link w:val="HTML0"/>
     <w:uiPriority w:val="99"/>
-    <w:semiHidden/>
     <w:unhideWhenUsed/>
     <w:rsid w:val="00D84416"/>
     <w:pPr>
@@ -1807,7 +2060,6 @@
     <w:basedOn w:val="a0"/>
     <w:link w:val="HTML"/>
     <w:uiPriority w:val="99"/>
-    <w:semiHidden/>
     <w:rsid w:val="00D84416"/>
     <w:rPr>
       <w:rFonts w:ascii="Courier New" w:eastAsia="Times New Roman" w:hAnsi="Courier New" w:cs="Courier New"/>

</xml_diff>